<commit_message>
docs: Phase 1 handoff state, dev-log, CHANGELOG v2.1.0, learning recap
- PROJECT-STATE.md: 重进交接文档(现状/待办/已定决策/分支链)
- dev-log: 追加 2026-06-22 Phase 1 流水与踩坑
- CHANGELOG: v2.1.0 作品集门户 Phase 1
- 学习文档: 补 Phase 1 实操回顾(node_modules/子路径/CRLF/Docker 案例)

Co-Authored-By: Claude Opus 4.8 (1M context) <noreply@anthropic.com>
</commit_message>
<xml_diff>
--- a/docs/learning/portfolio-integration-guide.docx
+++ b/docs/learning/portfolio-integration-guide.docx
@@ -2493,6 +2493,862 @@
     </w:p>
     <w:p>
       <w:pPr>
+        <w:pStyle w:val="Heading2"/>
+      </w:pPr>
+      <w:bookmarkStart w:id="43" w:name="phase-1-实操回顾把踩的坑变成学习案例"/>
+      <w:bookmarkEnd w:id="43"/>
+      <w:r>
+        <w:t xml:space="preserve">11. Phase 1 实操回顾(把踩的坑变成学习案例)</w:t>
+      </w:r>
+    </w:p>
+    <w:p>
+      <w:pPr>
+        <w:pStyle w:val="FirstParagraph"/>
+      </w:pPr>
+      <w:r>
+        <w:t xml:space="preserve">Phase 1 已经完成,整套门户在本地</w:t>
+      </w:r>
+      <w:r>
+        <w:t xml:space="preserve"> </w:t>
+      </w:r>
+      <w:r>
+        <w:rPr>
+          <w:rStyle w:val="VerbatimChar"/>
+        </w:rPr>
+        <w:t xml:space="preserve">docker compose</w:t>
+      </w:r>
+      <w:r>
+        <w:t xml:space="preserve"> </w:t>
+      </w:r>
+      <w:r>
+        <w:t xml:space="preserve">跑起来了。下面把实现过程中真实遇到的问题拎出来——这些就是面试时能讲的"工程细节"。</w:t>
+      </w:r>
+    </w:p>
+    <w:p>
+      <w:pPr>
+        <w:pStyle w:val="Heading3"/>
+      </w:pPr>
+      <w:bookmarkStart w:id="44" w:name="现在你能动手看的东西"/>
+      <w:bookmarkEnd w:id="44"/>
+      <w:r>
+        <w:t xml:space="preserve">11.1 现在你能动手看的东西</w:t>
+      </w:r>
+    </w:p>
+    <w:p>
+      <w:pPr>
+        <w:pStyle w:val="SourceCode"/>
+      </w:pPr>
+      <w:r>
+        <w:rPr>
+          <w:rStyle w:val="CommentTok"/>
+        </w:rPr>
+        <w:t xml:space="preserve"># 1. 启动 Docker Desktop(等引擎就绪)</w:t>
+      </w:r>
+      <w:r>
+        <w:br w:type="textWrapping"/>
+      </w:r>
+      <w:r>
+        <w:rPr>
+          <w:rStyle w:val="CommentTok"/>
+        </w:rPr>
+        <w:t xml:space="preserve"># 2. 构建前端</w:t>
+      </w:r>
+      <w:r>
+        <w:br w:type="textWrapping"/>
+      </w:r>
+      <w:r>
+        <w:rPr>
+          <w:rStyle w:val="FunctionTok"/>
+        </w:rPr>
+        <w:t xml:space="preserve">bash</w:t>
+      </w:r>
+      <w:r>
+        <w:rPr>
+          <w:rStyle w:val="NormalTok"/>
+        </w:rPr>
+        <w:t xml:space="preserve"> deploy/build-frontends.sh</w:t>
+      </w:r>
+      <w:r>
+        <w:br w:type="textWrapping"/>
+      </w:r>
+      <w:r>
+        <w:rPr>
+          <w:rStyle w:val="CommentTok"/>
+        </w:rPr>
+        <w:t xml:space="preserve"># 3. 起全部容器</w:t>
+      </w:r>
+      <w:r>
+        <w:br w:type="textWrapping"/>
+      </w:r>
+      <w:r>
+        <w:rPr>
+          <w:rStyle w:val="ExtensionTok"/>
+        </w:rPr>
+        <w:t xml:space="preserve">docker</w:t>
+      </w:r>
+      <w:r>
+        <w:rPr>
+          <w:rStyle w:val="NormalTok"/>
+        </w:rPr>
+        <w:t xml:space="preserve"> compose -f deploy/docker-compose.yml up -d --build</w:t>
+      </w:r>
+      <w:r>
+        <w:br w:type="textWrapping"/>
+      </w:r>
+      <w:r>
+        <w:rPr>
+          <w:rStyle w:val="CommentTok"/>
+        </w:rPr>
+        <w:t xml:space="preserve"># 4. 浏览器 http://127.0.0.1:8080</w:t>
+      </w:r>
+    </w:p>
+    <w:p>
+      <w:pPr>
+        <w:pStyle w:val="FirstParagraph"/>
+      </w:pPr>
+      <w:r>
+        <w:t xml:space="preserve">看完</w:t>
+      </w:r>
+      <w:r>
+        <w:t xml:space="preserve"> </w:t>
+      </w:r>
+      <w:r>
+        <w:rPr>
+          <w:rStyle w:val="VerbatimChar"/>
+        </w:rPr>
+        <w:t xml:space="preserve">docker compose ps</w:t>
+      </w:r>
+      <w:r>
+        <w:t xml:space="preserve">(看三个容器)、</w:t>
+      </w:r>
+      <w:r>
+        <w:rPr>
+          <w:rStyle w:val="VerbatimChar"/>
+        </w:rPr>
+        <w:t xml:space="preserve">docker logs deploy-rag-1</w:t>
+      </w:r>
+      <w:r>
+        <w:t xml:space="preserve">(看后端日志)、</w:t>
+      </w:r>
+      <w:r>
+        <w:rPr>
+          <w:rStyle w:val="VerbatimChar"/>
+        </w:rPr>
+        <w:t xml:space="preserve">docker logs deploy-nginx-1</w:t>
+      </w:r>
+      <w:r>
+        <w:t xml:space="preserve">,再对照</w:t>
+      </w:r>
+      <w:r>
+        <w:t xml:space="preserve"> </w:t>
+      </w:r>
+      <w:r>
+        <w:rPr>
+          <w:rStyle w:val="VerbatimChar"/>
+        </w:rPr>
+        <w:t xml:space="preserve">deploy/nginx/nginx.conf</w:t>
+      </w:r>
+      <w:r>
+        <w:t xml:space="preserve"> </w:t>
+      </w:r>
+      <w:r>
+        <w:t xml:space="preserve">理解请求怎么被分发。</w:t>
+      </w:r>
+    </w:p>
+    <w:p>
+      <w:pPr>
+        <w:pStyle w:val="Heading3"/>
+      </w:pPr>
+      <w:bookmarkStart w:id="45" w:name="坑-1node_modules-被提交进-git68mb"/>
+      <w:bookmarkEnd w:id="45"/>
+      <w:r>
+        <w:t xml:space="preserve">11.2 坑 1:node_modules 被提交进 git(68MB)</w:t>
+      </w:r>
+    </w:p>
+    <w:p>
+      <w:pPr>
+        <w:pStyle w:val="FirstParagraph"/>
+      </w:pPr>
+      <w:r>
+        <w:t xml:space="preserve">新建的</w:t>
+      </w:r>
+      <w:r>
+        <w:t xml:space="preserve"> </w:t>
+      </w:r>
+      <w:r>
+        <w:rPr>
+          <w:rStyle w:val="VerbatimChar"/>
+        </w:rPr>
+        <w:t xml:space="preserve">frontends/portfolio</w:t>
+      </w:r>
+      <w:r>
+        <w:t xml:space="preserve"> </w:t>
+      </w:r>
+      <w:r>
+        <w:t xml:space="preserve">没有</w:t>
+      </w:r>
+      <w:r>
+        <w:t xml:space="preserve"> </w:t>
+      </w:r>
+      <w:r>
+        <w:rPr>
+          <w:rStyle w:val="VerbatimChar"/>
+        </w:rPr>
+        <w:t xml:space="preserve">.gitignore</w:t>
+      </w:r>
+      <w:r>
+        <w:t xml:space="preserve">,</w:t>
+      </w:r>
+      <w:r>
+        <w:rPr>
+          <w:rStyle w:val="VerbatimChar"/>
+        </w:rPr>
+        <w:t xml:space="preserve">npm install</w:t>
+      </w:r>
+      <w:r>
+        <w:t xml:space="preserve"> </w:t>
+      </w:r>
+      <w:r>
+        <w:t xml:space="preserve">后</w:t>
+      </w:r>
+      <w:r>
+        <w:t xml:space="preserve"> </w:t>
+      </w:r>
+      <w:r>
+        <w:rPr>
+          <w:rStyle w:val="VerbatimChar"/>
+        </w:rPr>
+        <w:t xml:space="preserve">git add</w:t>
+      </w:r>
+      <w:r>
+        <w:t xml:space="preserve"> </w:t>
+      </w:r>
+      <w:r>
+        <w:t xml:space="preserve">把 3700+ 个依赖文件全提交了。</w:t>
+      </w:r>
+      <w:r>
+        <w:t xml:space="preserve"> </w:t>
+      </w:r>
+      <w:r>
+        <w:t xml:space="preserve">-</w:t>
+      </w:r>
+      <w:r>
+        <w:t xml:space="preserve"> </w:t>
+      </w:r>
+      <w:r>
+        <w:rPr>
+          <w:b/>
+        </w:rPr>
+        <w:t xml:space="preserve">教训</w:t>
+      </w:r>
+      <w:r>
+        <w:t xml:space="preserve">:任何前端工程,建好第一件事就是加</w:t>
+      </w:r>
+      <w:r>
+        <w:t xml:space="preserve"> </w:t>
+      </w:r>
+      <w:r>
+        <w:rPr>
+          <w:rStyle w:val="VerbatimChar"/>
+        </w:rPr>
+        <w:t xml:space="preserve">.gitignore</w:t>
+      </w:r>
+      <w:r>
+        <w:t xml:space="preserve">(node_modules/、dist/)。</w:t>
+      </w:r>
+      <w:r>
+        <w:t xml:space="preserve"> </w:t>
+      </w:r>
+      <w:r>
+        <w:t xml:space="preserve">-</w:t>
+      </w:r>
+      <w:r>
+        <w:t xml:space="preserve"> </w:t>
+      </w:r>
+      <w:r>
+        <w:rPr>
+          <w:b/>
+        </w:rPr>
+        <w:t xml:space="preserve">怎么修的</w:t>
+      </w:r>
+      <w:r>
+        <w:t xml:space="preserve">:因为分支没推送过,用</w:t>
+      </w:r>
+      <w:r>
+        <w:t xml:space="preserve"> </w:t>
+      </w:r>
+      <w:r>
+        <w:rPr>
+          <w:rStyle w:val="VerbatimChar"/>
+        </w:rPr>
+        <w:t xml:space="preserve">git reset --mixed</w:t>
+      </w:r>
+      <w:r>
+        <w:t xml:space="preserve"> </w:t>
+      </w:r>
+      <w:r>
+        <w:t xml:space="preserve">把那两个臃肿提交退回,补</w:t>
+      </w:r>
+      <w:r>
+        <w:t xml:space="preserve"> </w:t>
+      </w:r>
+      <w:r>
+        <w:rPr>
+          <w:rStyle w:val="VerbatimChar"/>
+        </w:rPr>
+        <w:t xml:space="preserve">.gitignore</w:t>
+      </w:r>
+      <w:r>
+        <w:t xml:space="preserve"> </w:t>
+      </w:r>
+      <w:r>
+        <w:t xml:space="preserve">后重新只提交源码。学到:</w:t>
+      </w:r>
+      <w:r>
+        <w:rPr>
+          <w:rStyle w:val="VerbatimChar"/>
+        </w:rPr>
+        <w:t xml:space="preserve">git reset --soft/--mixed/--hard</w:t>
+      </w:r>
+      <w:r>
+        <w:t xml:space="preserve"> </w:t>
+      </w:r>
+      <w:r>
+        <w:t xml:space="preserve">的区别。</w:t>
+      </w:r>
+    </w:p>
+    <w:p>
+      <w:pPr>
+        <w:pStyle w:val="Heading3"/>
+      </w:pPr>
+      <w:bookmarkStart w:id="46" w:name="坑-2子路径反向代理最值得讲的一个"/>
+      <w:bookmarkEnd w:id="46"/>
+      <w:r>
+        <w:t xml:space="preserve">11.3 坑 2:子路径反向代理(最值得讲的一个)</w:t>
+      </w:r>
+    </w:p>
+    <w:p>
+      <w:pPr>
+        <w:pStyle w:val="FirstParagraph"/>
+      </w:pPr>
+      <w:r>
+        <w:t xml:space="preserve">RAG/FC 的网页里 JS 是往</w:t>
+      </w:r>
+      <w:r>
+        <w:rPr>
+          <w:b/>
+        </w:rPr>
+        <w:t xml:space="preserve">绝对路径</w:t>
+      </w:r>
+      <w:r>
+        <w:t xml:space="preserve"> </w:t>
+      </w:r>
+      <w:r>
+        <w:rPr>
+          <w:rStyle w:val="VerbatimChar"/>
+        </w:rPr>
+        <w:t xml:space="preserve">/chat</w:t>
+      </w:r>
+      <w:r>
+        <w:t xml:space="preserve"> </w:t>
+      </w:r>
+      <w:r>
+        <w:t xml:space="preserve">发请求的。直接访问后端(8001)没问题,但一旦经 Nginx 挂到</w:t>
+      </w:r>
+      <w:r>
+        <w:t xml:space="preserve"> </w:t>
+      </w:r>
+      <w:r>
+        <w:rPr>
+          <w:rStyle w:val="VerbatimChar"/>
+        </w:rPr>
+        <w:t xml:space="preserve">/rag/</w:t>
+      </w:r>
+      <w:r>
+        <w:t xml:space="preserve"> </w:t>
+      </w:r>
+      <w:r>
+        <w:t xml:space="preserve">子路径下(在 iframe 里),浏览器在</w:t>
+      </w:r>
+      <w:r>
+        <w:t xml:space="preserve"> </w:t>
+      </w:r>
+      <w:r>
+        <w:rPr>
+          <w:rStyle w:val="VerbatimChar"/>
+        </w:rPr>
+        <w:t xml:space="preserve">/rag/</w:t>
+      </w:r>
+      <w:r>
+        <w:t xml:space="preserve"> </w:t>
+      </w:r>
+      <w:r>
+        <w:t xml:space="preserve">页面发</w:t>
+      </w:r>
+      <w:r>
+        <w:t xml:space="preserve"> </w:t>
+      </w:r>
+      <w:r>
+        <w:rPr>
+          <w:rStyle w:val="VerbatimChar"/>
+        </w:rPr>
+        <w:t xml:space="preserve">/chat</w:t>
+      </w:r>
+      <w:r>
+        <w:t xml:space="preserve"> </w:t>
+      </w:r>
+      <w:r>
+        <w:t xml:space="preserve">会打到</w:t>
+      </w:r>
+      <w:r>
+        <w:rPr>
+          <w:b/>
+        </w:rPr>
+        <w:t xml:space="preserve">站点根</w:t>
+      </w:r>
+      <w:r>
+        <w:t xml:space="preserve">而不是</w:t>
+      </w:r>
+      <w:r>
+        <w:t xml:space="preserve"> </w:t>
+      </w:r>
+      <w:r>
+        <w:rPr>
+          <w:rStyle w:val="VerbatimChar"/>
+        </w:rPr>
+        <w:t xml:space="preserve">/rag/chat</w:t>
+      </w:r>
+      <w:r>
+        <w:t xml:space="preserve">,功能就废了。</w:t>
+      </w:r>
+      <w:r>
+        <w:t xml:space="preserve"> </w:t>
+      </w:r>
+      <w:r>
+        <w:t xml:space="preserve">-</w:t>
+      </w:r>
+      <w:r>
+        <w:t xml:space="preserve"> </w:t>
+      </w:r>
+      <w:r>
+        <w:rPr>
+          <w:b/>
+        </w:rPr>
+        <w:t xml:space="preserve">修法</w:t>
+      </w:r>
+      <w:r>
+        <w:t xml:space="preserve">:把 fetch 路径从</w:t>
+      </w:r>
+      <w:r>
+        <w:t xml:space="preserve"> </w:t>
+      </w:r>
+      <w:r>
+        <w:rPr>
+          <w:rStyle w:val="VerbatimChar"/>
+        </w:rPr>
+        <w:t xml:space="preserve">/chat</w:t>
+      </w:r>
+      <w:r>
+        <w:t xml:space="preserve"> </w:t>
+      </w:r>
+      <w:r>
+        <w:t xml:space="preserve">改成相对的</w:t>
+      </w:r>
+      <w:r>
+        <w:t xml:space="preserve"> </w:t>
+      </w:r>
+      <w:r>
+        <w:rPr>
+          <w:rStyle w:val="VerbatimChar"/>
+        </w:rPr>
+        <w:t xml:space="preserve">chat</w:t>
+      </w:r>
+      <w:r>
+        <w:t xml:space="preserve">。浏览器在</w:t>
+      </w:r>
+      <w:r>
+        <w:t xml:space="preserve"> </w:t>
+      </w:r>
+      <w:r>
+        <w:rPr>
+          <w:rStyle w:val="VerbatimChar"/>
+        </w:rPr>
+        <w:t xml:space="preserve">/rag/</w:t>
+      </w:r>
+      <w:r>
+        <w:t xml:space="preserve"> </w:t>
+      </w:r>
+      <w:r>
+        <w:t xml:space="preserve">下解析相对路径</w:t>
+      </w:r>
+      <w:r>
+        <w:t xml:space="preserve"> </w:t>
+      </w:r>
+      <w:r>
+        <w:rPr>
+          <w:rStyle w:val="VerbatimChar"/>
+        </w:rPr>
+        <w:t xml:space="preserve">chat</w:t>
+      </w:r>
+      <w:r>
+        <w:t xml:space="preserve"> </w:t>
+      </w:r>
+      <w:r>
+        <w:t xml:space="preserve">→</w:t>
+      </w:r>
+      <w:r>
+        <w:t xml:space="preserve"> </w:t>
+      </w:r>
+      <w:r>
+        <w:rPr>
+          <w:rStyle w:val="VerbatimChar"/>
+        </w:rPr>
+        <w:t xml:space="preserve">/rag/chat</w:t>
+      </w:r>
+      <w:r>
+        <w:t xml:space="preserve"> </w:t>
+      </w:r>
+      <w:r>
+        <w:t xml:space="preserve">→ Nginx 的</w:t>
+      </w:r>
+      <w:r>
+        <w:t xml:space="preserve"> </w:t>
+      </w:r>
+      <w:r>
+        <w:rPr>
+          <w:rStyle w:val="VerbatimChar"/>
+        </w:rPr>
+        <w:t xml:space="preserve">location /rag/ { proxy_pass http://rag:8001/; }</w:t>
+      </w:r>
+      <w:r>
+        <w:t xml:space="preserve"> </w:t>
+      </w:r>
+      <w:r>
+        <w:t xml:space="preserve">去掉前缀 → 后端收到</w:t>
+      </w:r>
+      <w:r>
+        <w:t xml:space="preserve"> </w:t>
+      </w:r>
+      <w:r>
+        <w:rPr>
+          <w:rStyle w:val="VerbatimChar"/>
+        </w:rPr>
+        <w:t xml:space="preserve">/chat</w:t>
+      </w:r>
+      <w:r>
+        <w:t xml:space="preserve">。</w:t>
+      </w:r>
+      <w:r>
+        <w:t xml:space="preserve"> </w:t>
+      </w:r>
+      <w:r>
+        <w:t xml:space="preserve">-</w:t>
+      </w:r>
+      <w:r>
+        <w:t xml:space="preserve"> </w:t>
+      </w:r>
+      <w:r>
+        <w:rPr>
+          <w:b/>
+        </w:rPr>
+        <w:t xml:space="preserve">关键知识点</w:t>
+      </w:r>
+      <w:r>
+        <w:t xml:space="preserve">:</w:t>
+      </w:r>
+      <w:r>
+        <w:rPr>
+          <w:rStyle w:val="VerbatimChar"/>
+        </w:rPr>
+        <w:t xml:space="preserve">proxy_pass</w:t>
+      </w:r>
+      <w:r>
+        <w:t xml:space="preserve"> </w:t>
+      </w:r>
+      <w:r>
+        <w:t xml:space="preserve">结尾带不带</w:t>
+      </w:r>
+      <w:r>
+        <w:t xml:space="preserve"> </w:t>
+      </w:r>
+      <w:r>
+        <w:rPr>
+          <w:rStyle w:val="VerbatimChar"/>
+        </w:rPr>
+        <w:t xml:space="preserve">/</w:t>
+      </w:r>
+      <w:r>
+        <w:t xml:space="preserve"> </w:t>
+      </w:r>
+      <w:r>
+        <w:t xml:space="preserve">决定要不要剥前缀;相对 URL 相对"当前文档路径"解析(所以 iframe 的 src 必须带结尾斜杠</w:t>
+      </w:r>
+      <w:r>
+        <w:t xml:space="preserve"> </w:t>
+      </w:r>
+      <w:r>
+        <w:rPr>
+          <w:rStyle w:val="VerbatimChar"/>
+        </w:rPr>
+        <w:t xml:space="preserve">/rag/</w:t>
+      </w:r>
+      <w:r>
+        <w:t xml:space="preserve">)。</w:t>
+      </w:r>
+    </w:p>
+    <w:p>
+      <w:pPr>
+        <w:pStyle w:val="Heading3"/>
+      </w:pPr>
+      <w:bookmarkStart w:id="47" w:name="坑-3windows-换行符crlf"/>
+      <w:bookmarkEnd w:id="47"/>
+      <w:r>
+        <w:t xml:space="preserve">11.4 坑 3:Windows 换行符(CRLF)</w:t>
+      </w:r>
+    </w:p>
+    <w:p>
+      <w:pPr>
+        <w:pStyle w:val="FirstParagraph"/>
+      </w:pPr>
+      <w:r>
+        <w:t xml:space="preserve">Git 在 Windows 默认把</w:t>
+      </w:r>
+      <w:r>
+        <w:t xml:space="preserve"> </w:t>
+      </w:r>
+      <w:r>
+        <w:rPr>
+          <w:rStyle w:val="VerbatimChar"/>
+        </w:rPr>
+        <w:t xml:space="preserve">.sh</w:t>
+      </w:r>
+      <w:r>
+        <w:t xml:space="preserve">、Dockerfile 检出成 CRLF。bash 执行带</w:t>
+      </w:r>
+      <w:r>
+        <w:t xml:space="preserve"> </w:t>
+      </w:r>
+      <w:r>
+        <w:rPr>
+          <w:rStyle w:val="VerbatimChar"/>
+        </w:rPr>
+        <w:t xml:space="preserve">\r</w:t>
+      </w:r>
+      <w:r>
+        <w:t xml:space="preserve"> </w:t>
+      </w:r>
+      <w:r>
+        <w:t xml:space="preserve">的脚本会报</w:t>
+      </w:r>
+      <w:r>
+        <w:t xml:space="preserve"> </w:t>
+      </w:r>
+      <w:r>
+        <w:rPr>
+          <w:rStyle w:val="VerbatimChar"/>
+        </w:rPr>
+        <w:t xml:space="preserve">'\r': command not found</w:t>
+      </w:r>
+      <w:r>
+        <w:t xml:space="preserve">,Linux 容器里也可能出错。</w:t>
+      </w:r>
+      <w:r>
+        <w:t xml:space="preserve"> </w:t>
+      </w:r>
+      <w:r>
+        <w:t xml:space="preserve">-</w:t>
+      </w:r>
+      <w:r>
+        <w:t xml:space="preserve"> </w:t>
+      </w:r>
+      <w:r>
+        <w:rPr>
+          <w:b/>
+        </w:rPr>
+        <w:t xml:space="preserve">修法</w:t>
+      </w:r>
+      <w:r>
+        <w:t xml:space="preserve">:加</w:t>
+      </w:r>
+      <w:r>
+        <w:t xml:space="preserve"> </w:t>
+      </w:r>
+      <w:r>
+        <w:rPr>
+          <w:rStyle w:val="VerbatimChar"/>
+        </w:rPr>
+        <w:t xml:space="preserve">.gitattributes</w:t>
+      </w:r>
+      <w:r>
+        <w:t xml:space="preserve">,对</w:t>
+      </w:r>
+      <w:r>
+        <w:t xml:space="preserve"> </w:t>
+      </w:r>
+      <w:r>
+        <w:rPr>
+          <w:rStyle w:val="VerbatimChar"/>
+        </w:rPr>
+        <w:t xml:space="preserve">*.sh</w:t>
+      </w:r>
+      <w:r>
+        <w:t xml:space="preserve">/</w:t>
+      </w:r>
+      <w:r>
+        <w:rPr>
+          <w:rStyle w:val="VerbatimChar"/>
+        </w:rPr>
+        <w:t xml:space="preserve">Dockerfile</w:t>
+      </w:r>
+      <w:r>
+        <w:t xml:space="preserve">/</w:t>
+      </w:r>
+      <w:r>
+        <w:rPr>
+          <w:rStyle w:val="VerbatimChar"/>
+        </w:rPr>
+        <w:t xml:space="preserve">*.conf</w:t>
+      </w:r>
+      <w:r>
+        <w:t xml:space="preserve"> </w:t>
+      </w:r>
+      <w:r>
+        <w:t xml:space="preserve">强制</w:t>
+      </w:r>
+      <w:r>
+        <w:t xml:space="preserve"> </w:t>
+      </w:r>
+      <w:r>
+        <w:rPr>
+          <w:rStyle w:val="VerbatimChar"/>
+        </w:rPr>
+        <w:t xml:space="preserve">eol=lf</w:t>
+      </w:r>
+      <w:r>
+        <w:t xml:space="preserve">。这是跨平台协作的标准做法。</w:t>
+      </w:r>
+    </w:p>
+    <w:p>
+      <w:pPr>
+        <w:pStyle w:val="Heading3"/>
+      </w:pPr>
+      <w:bookmarkStart w:id="48" w:name="坑-4docker-环境"/>
+      <w:bookmarkEnd w:id="48"/>
+      <w:r>
+        <w:t xml:space="preserve">11.5 坑 4:Docker 环境</w:t>
+      </w:r>
+    </w:p>
+    <w:p>
+      <w:pPr>
+        <w:pStyle w:val="Compact"/>
+        <w:numPr>
+          <w:numId w:val="1010"/>
+          <w:ilvl w:val="0"/>
+        </w:numPr>
+      </w:pPr>
+      <w:r>
+        <w:t xml:space="preserve">Docker CLI 装了不代表引擎在跑——</w:t>
+      </w:r>
+      <w:r>
+        <w:rPr>
+          <w:b/>
+        </w:rPr>
+        <w:t xml:space="preserve">Docker Desktop 必须先启动</w:t>
+      </w:r>
+      <w:r>
+        <w:t xml:space="preserve">(否则报找不到</w:t>
+      </w:r>
+      <w:r>
+        <w:t xml:space="preserve"> </w:t>
+      </w:r>
+      <w:r>
+        <w:rPr>
+          <w:rStyle w:val="VerbatimChar"/>
+        </w:rPr>
+        <w:t xml:space="preserve">dockerDesktopLinuxEngine</w:t>
+      </w:r>
+      <w:r>
+        <w:t xml:space="preserve"> </w:t>
+      </w:r>
+      <w:r>
+        <w:t xml:space="preserve">管道)。</w:t>
+      </w:r>
+    </w:p>
+    <w:p>
+      <w:pPr>
+        <w:pStyle w:val="Compact"/>
+        <w:numPr>
+          <w:numId w:val="1010"/>
+          <w:ilvl w:val="0"/>
+        </w:numPr>
+      </w:pPr>
+      <w:r>
+        <w:t xml:space="preserve">国内拉 Docker Hub 镜像易超时:先</w:t>
+      </w:r>
+      <w:r>
+        <w:t xml:space="preserve"> </w:t>
+      </w:r>
+      <w:r>
+        <w:rPr>
+          <w:rStyle w:val="VerbatimChar"/>
+        </w:rPr>
+        <w:t xml:space="preserve">docker pull nginx:1.27-alpine</w:t>
+      </w:r>
+      <w:r>
+        <w:t xml:space="preserve">、</w:t>
+      </w:r>
+      <w:r>
+        <w:rPr>
+          <w:rStyle w:val="VerbatimChar"/>
+        </w:rPr>
+        <w:t xml:space="preserve">docker pull python:3.12-slim</w:t>
+      </w:r>
+      <w:r>
+        <w:t xml:space="preserve"> </w:t>
+      </w:r>
+      <w:r>
+        <w:t xml:space="preserve">预缓存,或在 Docker Desktop 配镜像加速器。</w:t>
+      </w:r>
+    </w:p>
+    <w:p>
+      <w:pPr>
+        <w:pStyle w:val="Compact"/>
+        <w:numPr>
+          <w:numId w:val="1010"/>
+          <w:ilvl w:val="0"/>
+        </w:numPr>
+      </w:pPr>
+      <w:r>
+        <w:t xml:space="preserve">2G 内存小服务器:别在本机跑大模型,走云端 API;加 swap。</w:t>
+      </w:r>
+    </w:p>
+    <w:p>
+      <w:pPr>
+        <w:pStyle w:val="Heading3"/>
+      </w:pPr>
+      <w:bookmarkStart w:id="49" w:name="这次用到的工程流程也是能讲的"/>
+      <w:bookmarkEnd w:id="49"/>
+      <w:r>
+        <w:t xml:space="preserve">11.6 这次用到的工程流程(也是能讲的)</w:t>
+      </w:r>
+    </w:p>
+    <w:p>
+      <w:pPr>
+        <w:pStyle w:val="FirstParagraph"/>
+      </w:pPr>
+      <w:r>
+        <w:t xml:space="preserve">需求脑暴(brainstorming)→ 写设计文档(spec)→ 写实现计划(plan,拆成可验收任务)→ 子代理逐任务实现 + 评审 → 整分支总评审 → 收尾。每个任务 TDD/验证 + 频繁提交。这套"先设计后实现、带评审关卡"的习惯,本身就是工程素养。</w:t>
+      </w:r>
+    </w:p>
+    <w:p>
+      <w:r>
+        <w:pict>
+          <v:rect style="width:0;height:1.5pt" o:hralign="center" o:hrstd="t" o:hr="t"/>
+        </w:pict>
+      </w:r>
+    </w:p>
+    <w:p>
+      <w:pPr>
         <w:pStyle w:val="BlockText"/>
       </w:pPr>
       <w:r>
@@ -2607,7 +3463,7 @@
     </w:lvl>
   </w:abstractNum>
   <w:abstractNum w:abstractNumId="990">
-    <w:nsid w:val="aa80ecc2"/>
+    <w:nsid w:val="e92bb8e1"/>
     <w:multiLevelType w:val="multilevel"/>
     <w:lvl w:ilvl="0">
       <w:numFmt w:val="bullet"/>
@@ -2688,7 +3544,7 @@
     </w:lvl>
   </w:abstractNum>
   <w:abstractNum w:abstractNumId="991">
-    <w:nsid w:val="89686ab5"/>
+    <w:nsid w:val="74e3e5c6"/>
     <w:multiLevelType w:val="multilevel"/>
     <w:lvl w:ilvl="0">
       <w:numFmt w:val="bullet"/>
@@ -2769,7 +3625,7 @@
     </w:lvl>
   </w:abstractNum>
   <w:abstractNum w:abstractNumId="99411">
-    <w:nsid w:val="af53c147"/>
+    <w:nsid w:val="7097b990"/>
     <w:multiLevelType w:val="multilevel"/>
     <w:lvl w:ilvl="0">
       <w:start w:val="1"/>
@@ -2930,6 +3786,9 @@
     <w:lvlOverride w:ilvl="6">
       <w:startOverride w:val="1"/>
     </w:lvlOverride>
+  </w:num>
+  <w:num w:numId="1010">
+    <w:abstractNumId w:val="991"/>
   </w:num>
 </w:numbering>
 </file>

</xml_diff>